<commit_message>
Changes in IRC BPP 2025
</commit_message>
<xml_diff>
--- a/Team Inferno Corporate Report.docx
+++ b/Team Inferno Corporate Report.docx
@@ -730,7 +730,7 @@
         <w:spacing w:after="200" w:before="0" w:line="264" w:lineRule="auto"/>
       </w:pPr>
       <w:r>
-        <w:t xml:space="preserve">1. Executive Overview: Business Partnership Plan at IRC 2025</w:t>
+        <w:t xml:space="preserve">1. Executive Overview</w:t>
       </w:r>
     </w:p>
     <w:p>
@@ -738,7 +738,7 @@
         <w:spacing w:after="200" w:before="0" w:line="264" w:lineRule="auto"/>
       </w:pPr>
       <w:r>
-        <w:t xml:space="preserve">For the International Rover Challenge (IRC) 2025, the corporate department prepared and presented the Business Partnership Plan (BPP) on behalf of Team Inferno DTU, representing Delhi Technological University under the captaincy of Garvit Jain. The plan responded to a problem statement in which the team's funding had been halted after sponsors and the university withdrew support during a global economic shutdown. Our central proposal was the InfernoCoin (IC), a profit-linked token through which partners could invest in Team Inferno's projects, redeem the team's services, and take part in its governance. The presentation also showcased the supporting corporate work completed during the cycle, including the team website, IRC 2025 social media creatives, and a Strategic Alliance Plan. The financial structure of the plan was detailed and ambitious. However, the coin remained a standalone concept without a working real-world mechanism for sponsors, and the visual execution of the deck was more casual than a corporate pitch demands. Both shortcomings directly shaped the Inferno Exchange and the brand overhaul of the following cycle.</w:t>
+        <w:t xml:space="preserve">For IRC 2025, our BPP addressed a funding crisis scenario and proposed the InfernoCoin (IC), a profit-linked token that let partners invest across our projects, redeem our services, and take part in team decisions. The financial model was detailed and set our pitch apart from a conventional sponsorship request. However, the coin remained a standalone concept with no defined real-world mechanism for sponsors, a gap we closed in the following cycle with the Inferno Exchange.</w:t>
       </w:r>
     </w:p>
     <w:p>
@@ -748,7 +748,7 @@
         <w:spacing w:after="200" w:before="0" w:line="264" w:lineRule="auto"/>
       </w:pPr>
       <w:r>
-        <w:t xml:space="preserve">2. Problem Statement &amp; Strategic Objectives</w:t>
+        <w:t xml:space="preserve">2. Problem Statement &amp; Approach</w:t>
       </w:r>
     </w:p>
     <w:p>
@@ -766,7 +766,7 @@
         <w:spacing w:after="200" w:before="0" w:line="264" w:lineRule="auto"/>
       </w:pPr>
       <w:r>
-        <w:t xml:space="preserve">The BPP problem statement described a scenario set in January 2025, in which our globally recognized rover team faced a funding halt after sponsors and the university withdrew support due to a global economic shutdown. The stated aim was to revive development by securing new sponsorships through professional email outreach and an enhanced online presence.</w:t>
+        <w:t xml:space="preserve">In January 2025, the team faced a funding halt as sponsors and the university withdrew support due to a global economic shutdown. The goal was to revive development by securing new sponsorships through professional email outreach and a stronger online presence.</w:t>
       </w:r>
     </w:p>
     <w:p>
@@ -776,59 +776,77 @@
         <w:spacing w:after="120" w:before="0" w:line="264" w:lineRule="auto"/>
       </w:pPr>
       <w:r>
-        <w:t xml:space="preserve">2.2 Primary Objectives</w:t>
-      </w:r>
-    </w:p>
-    <w:p>
-      <w:pPr>
-        <w:pStyle w:val="ListParagraph"/>
-        <w:numPr>
-          <w:ilvl w:val="0"/>
-          <w:numId w:val="2"/>
-        </w:numPr>
-        <w:spacing w:after="0" w:before="0" w:line="264" w:lineRule="auto"/>
-      </w:pPr>
-      <w:r>
-        <w:t xml:space="preserve">Address the challenges of limited funding and high development costs that prevent ambitious ideas from reaching fruition.</w:t>
-      </w:r>
-    </w:p>
-    <w:p>
-      <w:pPr>
-        <w:pStyle w:val="ListParagraph"/>
-        <w:numPr>
-          <w:ilvl w:val="0"/>
-          <w:numId w:val="2"/>
-        </w:numPr>
-        <w:spacing w:after="0" w:before="0" w:line="264" w:lineRule="auto"/>
-      </w:pPr>
-      <w:r>
-        <w:t xml:space="preserve">Position Team Inferno as an internationally recognized, award-winning student robotics team whose engineering expertise and problem-solving can bridge this funding gap.</w:t>
-      </w:r>
-    </w:p>
-    <w:p>
-      <w:pPr>
-        <w:pStyle w:val="ListParagraph"/>
-        <w:numPr>
-          <w:ilvl w:val="0"/>
-          <w:numId w:val="2"/>
-        </w:numPr>
-        <w:spacing w:after="0" w:before="0" w:line="264" w:lineRule="auto"/>
-      </w:pPr>
-      <w:r>
-        <w:t xml:space="preserve">Present our track record of cost-effective, successful projects as the basis for collaboration with visionary partners.</w:t>
-      </w:r>
-    </w:p>
-    <w:p>
-      <w:pPr>
-        <w:pStyle w:val="ListParagraph"/>
-        <w:numPr>
-          <w:ilvl w:val="0"/>
-          <w:numId w:val="2"/>
-        </w:numPr>
-        <w:spacing w:after="120" w:before="0" w:line="264" w:lineRule="auto"/>
-      </w:pPr>
-      <w:r>
-        <w:t xml:space="preserve">Design an incentive mechanism that gives partners a tangible financial and service-based return on their collaboration.</w:t>
+        <w:t xml:space="preserve">2.2 Our Approach</w:t>
+      </w:r>
+    </w:p>
+    <w:p>
+      <w:pPr>
+        <w:pStyle w:val="ListParagraph"/>
+        <w:numPr>
+          <w:ilvl w:val="0"/>
+          <w:numId w:val="2"/>
+        </w:numPr>
+        <w:spacing w:after="0" w:before="0" w:line="264" w:lineRule="auto"/>
+      </w:pPr>
+      <w:r>
+        <w:rPr>
+          <w:b/>
+          <w:bCs/>
+        </w:rPr>
+        <w:t xml:space="preserve">2.2.1 Target Partners: </w:t>
+      </w:r>
+      <w:r>
+        <w:t xml:space="preserve">Companies seeking diversified investments, firms in essential fields, and organizations looking for the next big thing.</w:t>
+      </w:r>
+    </w:p>
+    <w:p>
+      <w:pPr>
+        <w:pStyle w:val="ListParagraph"/>
+        <w:numPr>
+          <w:ilvl w:val="0"/>
+          <w:numId w:val="2"/>
+        </w:numPr>
+        <w:spacing w:after="0" w:before="0" w:line="264" w:lineRule="auto"/>
+      </w:pPr>
+      <w:r>
+        <w:rPr>
+          <w:b/>
+          <w:bCs/>
+        </w:rPr>
+        <w:t xml:space="preserve">2.2.2 Our Offering: </w:t>
+      </w:r>
+      <w:r>
+        <w:t xml:space="preserve">Our R&amp;D capability and a strong student community, backed by a track record of cost-effective projects.</w:t>
+      </w:r>
+    </w:p>
+    <w:p>
+      <w:pPr>
+        <w:pStyle w:val="ListParagraph"/>
+        <w:numPr>
+          <w:ilvl w:val="0"/>
+          <w:numId w:val="2"/>
+        </w:numPr>
+        <w:spacing w:after="120" w:before="0" w:line="264" w:lineRule="auto"/>
+      </w:pPr>
+      <w:r>
+        <w:rPr>
+          <w:b/>
+          <w:bCs/>
+        </w:rPr>
+        <w:t xml:space="preserve">2.2.3 Incentive Model: </w:t>
+      </w:r>
+      <w:r>
+        <w:t xml:space="preserve">The InfernoCoin, giving partners both a financial and a service-based return on collaboration.</w:t>
+      </w:r>
+    </w:p>
+    <w:p>
+      <w:pPr>
+        <w:pStyle w:val="Heading1"/>
+        <w:keepNext/>
+        <w:spacing w:after="200" w:before="0" w:line="264" w:lineRule="auto"/>
+      </w:pPr>
+      <w:r>
+        <w:t xml:space="preserve">3. The InfernoCoin Model</w:t>
       </w:r>
     </w:p>
     <w:p>
@@ -838,47 +856,107 @@
         <w:spacing w:after="120" w:before="0" w:line="264" w:lineRule="auto"/>
       </w:pPr>
       <w:r>
-        <w:t xml:space="preserve">2.3 Target Segments &amp; Value Proposition</w:t>
-      </w:r>
-    </w:p>
-    <w:p>
-      <w:pPr>
-        <w:pStyle w:val="ListParagraph"/>
-        <w:numPr>
-          <w:ilvl w:val="0"/>
-          <w:numId w:val="2"/>
-        </w:numPr>
-        <w:spacing w:after="0" w:before="0" w:line="264" w:lineRule="auto"/>
-      </w:pPr>
-      <w:r>
-        <w:rPr>
-          <w:b/>
-          <w:bCs/>
-        </w:rPr>
-        <w:t xml:space="preserve">2.3.1 Target Companies: </w:t>
-      </w:r>
-      <w:r>
-        <w:t xml:space="preserve">We identified three segments of prospective partners: companies seeking diversified investments, firms operating in essential fields, and organizations looking for the next big thing.</w:t>
-      </w:r>
-    </w:p>
-    <w:p>
-      <w:pPr>
-        <w:pStyle w:val="ListParagraph"/>
-        <w:numPr>
-          <w:ilvl w:val="0"/>
-          <w:numId w:val="2"/>
-        </w:numPr>
-        <w:spacing w:after="120" w:before="0" w:line="264" w:lineRule="auto"/>
-      </w:pPr>
-      <w:r>
-        <w:rPr>
-          <w:b/>
-          <w:bCs/>
-        </w:rPr>
-        <w:t xml:space="preserve">2.3.2 Our Offering: </w:t>
-      </w:r>
-      <w:r>
-        <w:t xml:space="preserve">In return, we offered partners access to our innovative R&amp;D work and to a strong student community.</w:t>
+        <w:t xml:space="preserve">3.1 Core Structure</w:t>
+      </w:r>
+    </w:p>
+    <w:p>
+      <w:pPr>
+        <w:pStyle w:val="ListParagraph"/>
+        <w:numPr>
+          <w:ilvl w:val="0"/>
+          <w:numId w:val="2"/>
+        </w:numPr>
+        <w:spacing w:after="0" w:before="0" w:line="264" w:lineRule="auto"/>
+      </w:pPr>
+      <w:r>
+        <w:rPr>
+          <w:b/>
+          <w:bCs/>
+        </w:rPr>
+        <w:t xml:space="preserve">3.1.1 Supply &amp; Value: </w:t>
+      </w:r>
+      <w:r>
+        <w:t xml:space="preserve">10,000 ICs collectively holding 10% of our profits from collaborative projects, at an initial value of Rs. 50 per coin.</w:t>
+      </w:r>
+    </w:p>
+    <w:p>
+      <w:pPr>
+        <w:pStyle w:val="ListParagraph"/>
+        <w:numPr>
+          <w:ilvl w:val="0"/>
+          <w:numId w:val="2"/>
+        </w:numPr>
+        <w:spacing w:after="0" w:before="0" w:line="264" w:lineRule="auto"/>
+      </w:pPr>
+      <w:r>
+        <w:rPr>
+          <w:b/>
+          <w:bCs/>
+        </w:rPr>
+        <w:t xml:space="preserve">3.1.2 Allocation: </w:t>
+      </w:r>
+      <w:r>
+        <w:t xml:space="preserve">35% for profit sharing with R&amp;D partners, 14% for an investment pool, and 51% held as a team reserve to retain majority control.</w:t>
+      </w:r>
+    </w:p>
+    <w:p>
+      <w:pPr>
+        <w:pStyle w:val="ListParagraph"/>
+        <w:numPr>
+          <w:ilvl w:val="0"/>
+          <w:numId w:val="2"/>
+        </w:numPr>
+        <w:spacing w:after="0" w:before="0" w:line="264" w:lineRule="auto"/>
+      </w:pPr>
+      <w:r>
+        <w:rPr>
+          <w:b/>
+          <w:bCs/>
+        </w:rPr>
+        <w:t xml:space="preserve">3.1.3 Issuance Logic: </w:t>
+      </w:r>
+      <w:r>
+        <w:t xml:space="preserve">Coins were awarded based on a partner's share of total contributions, adjusted for workload weight, while the profit share was calculated from workload weight and collaborator effect.</w:t>
+      </w:r>
+    </w:p>
+    <w:p>
+      <w:pPr>
+        <w:pStyle w:val="ListParagraph"/>
+        <w:numPr>
+          <w:ilvl w:val="0"/>
+          <w:numId w:val="2"/>
+        </w:numPr>
+        <w:spacing w:after="0" w:before="0" w:line="264" w:lineRule="auto"/>
+      </w:pPr>
+      <w:r>
+        <w:rPr>
+          <w:b/>
+          <w:bCs/>
+        </w:rPr>
+        <w:t xml:space="preserve">3.1.4 Redeemable Services: </w:t>
+      </w:r>
+      <w:r>
+        <w:t xml:space="preserve">ICs could be redeemed for educational resources (Rs. 5,000), data and analytics (Rs. 6,000), design and marketing (Rs. 8,000), and promotional services (Rs. 8,000), priced dynamically with the IC value.</w:t>
+      </w:r>
+    </w:p>
+    <w:p>
+      <w:pPr>
+        <w:pStyle w:val="ListParagraph"/>
+        <w:numPr>
+          <w:ilvl w:val="0"/>
+          <w:numId w:val="2"/>
+        </w:numPr>
+        <w:spacing w:after="120" w:before="0" w:line="264" w:lineRule="auto"/>
+      </w:pPr>
+      <w:r>
+        <w:rPr>
+          <w:b/>
+          <w:bCs/>
+        </w:rPr>
+        <w:t xml:space="preserve">3.1.5 Holder Benefits: </w:t>
+      </w:r>
+      <w:r>
+        <w:t xml:space="preserve">Tiered discounts on our services (Bronze 10%, Silver 15%, Gold 25%), voting rights on collaborations and strategy, and access to the Inferno Community Forum &amp; Trading Hub for networking and trading.</w:t>
       </w:r>
     </w:p>
     <w:p>
@@ -888,125 +966,87 @@
         <w:spacing w:after="200" w:before="0" w:line="264" w:lineRule="auto"/>
       </w:pPr>
       <w:r>
-        <w:t xml:space="preserve">3. The InfernoCoin Model</w:t>
+        <w:t xml:space="preserve">4. Supporting Deliverables</w:t>
       </w:r>
     </w:p>
     <w:p>
       <w:pPr>
         <w:pStyle w:val="Heading2"/>
         <w:keepNext/>
+        <w:spacing w:after="120" w:before="0" w:line="264" w:lineRule="auto"/>
+      </w:pPr>
+      <w:r>
+        <w:t xml:space="preserve">4.1 Other Tasks Completed</w:t>
+      </w:r>
+    </w:p>
+    <w:p>
+      <w:pPr>
+        <w:pStyle w:val="ListParagraph"/>
+        <w:numPr>
+          <w:ilvl w:val="0"/>
+          <w:numId w:val="2"/>
+        </w:numPr>
+        <w:spacing w:after="0" w:before="0" w:line="264" w:lineRule="auto"/>
+      </w:pPr>
+      <w:r>
+        <w:rPr>
+          <w:b/>
+          <w:bCs/>
+        </w:rPr>
+        <w:t xml:space="preserve">4.1.1 Website: </w:t>
+      </w:r>
+      <w:r>
+        <w:t xml:space="preserve">Built infernodtu.in as a sponsor-facing site with a partnership call to action, competition pages, achievements, and a sponsor showcase.</w:t>
+      </w:r>
+    </w:p>
+    <w:p>
+      <w:pPr>
+        <w:pStyle w:val="ListParagraph"/>
+        <w:numPr>
+          <w:ilvl w:val="0"/>
+          <w:numId w:val="2"/>
+        </w:numPr>
+        <w:spacing w:after="0" w:before="0" w:line="264" w:lineRule="auto"/>
+      </w:pPr>
+      <w:r>
+        <w:rPr>
+          <w:b/>
+          <w:bCs/>
+        </w:rPr>
+        <w:t xml:space="preserve">4.1.2 Social Media: </w:t>
+      </w:r>
+      <w:r>
+        <w:t xml:space="preserve">Ran the "Ready for IRC 2025" campaign.</w:t>
+      </w:r>
+    </w:p>
+    <w:p>
+      <w:pPr>
+        <w:pStyle w:val="ListParagraph"/>
+        <w:numPr>
+          <w:ilvl w:val="0"/>
+          <w:numId w:val="2"/>
+        </w:numPr>
+        <w:spacing w:after="120" w:before="0" w:line="264" w:lineRule="auto"/>
+      </w:pPr>
+      <w:r>
+        <w:rPr>
+          <w:b/>
+          <w:bCs/>
+        </w:rPr>
+        <w:t xml:space="preserve">4.1.3 Strategic Alliance Plan: </w:t>
+      </w:r>
+      <w:r>
+        <w:t xml:space="preserve">Prepared a partnership proposal document for sponsor outreach.</w:t>
+      </w:r>
+    </w:p>
+    <w:p>
+      <w:pPr>
+        <w:pStyle w:val="Heading1"/>
+        <w:keepNext/>
         <w:spacing w:after="200" w:before="0" w:line="264" w:lineRule="auto"/>
       </w:pPr>
       <w:r>
-        <w:t xml:space="preserve">3.1 Concept &amp; Core Features</w:t>
-      </w:r>
-    </w:p>
-    <w:p>
-      <w:pPr>
-        <w:spacing w:after="120" w:before="0" w:line="264" w:lineRule="auto"/>
-      </w:pPr>
-      <w:r>
-        <w:t xml:space="preserve">The InfernoCoin was presented as the driving force of the BPP. We positioned it as more than a cryptoasset: a mechanism that allows collaborators to passively invest in, and diversify across, multiple high-potential projects driven by Team Inferno. This is the concept referred to as the "Inferno Coin" under Iteration 1 of the Corporate &amp; Management Report.</w:t>
-      </w:r>
-    </w:p>
-    <w:p>
-      <w:pPr>
-        <w:pStyle w:val="ListParagraph"/>
-        <w:numPr>
-          <w:ilvl w:val="0"/>
-          <w:numId w:val="2"/>
-        </w:numPr>
-        <w:spacing w:after="0" w:before="0" w:line="264" w:lineRule="auto"/>
-      </w:pPr>
-      <w:r>
-        <w:rPr>
-          <w:b/>
-          <w:bCs/>
-        </w:rPr>
-        <w:t xml:space="preserve">3.1.1 Profit-Linked Value: </w:t>
-      </w:r>
-      <w:r>
-        <w:t xml:space="preserve">The value of the coin was tied to Team Inferno's profits from collaborative projects.</w:t>
-      </w:r>
-    </w:p>
-    <w:p>
-      <w:pPr>
-        <w:pStyle w:val="ListParagraph"/>
-        <w:numPr>
-          <w:ilvl w:val="0"/>
-          <w:numId w:val="2"/>
-        </w:numPr>
-        <w:spacing w:after="0" w:before="0" w:line="264" w:lineRule="auto"/>
-      </w:pPr>
-      <w:r>
-        <w:rPr>
-          <w:b/>
-          <w:bCs/>
-        </w:rPr>
-        <w:t xml:space="preserve">3.1.2 Diversified Investment: </w:t>
-      </w:r>
-      <w:r>
-        <w:t xml:space="preserve">Holders gained exposure across several team projects rather than a single initiative.</w:t>
-      </w:r>
-    </w:p>
-    <w:p>
-      <w:pPr>
-        <w:pStyle w:val="ListParagraph"/>
-        <w:numPr>
-          <w:ilvl w:val="0"/>
-          <w:numId w:val="2"/>
-        </w:numPr>
-        <w:spacing w:after="0" w:before="0" w:line="264" w:lineRule="auto"/>
-      </w:pPr>
-      <w:r>
-        <w:rPr>
-          <w:b/>
-          <w:bCs/>
-        </w:rPr>
-        <w:t xml:space="preserve">3.1.3 Tradable Asset: </w:t>
-      </w:r>
-      <w:r>
-        <w:t xml:space="preserve">Coins could be traded securely in a dedicated marketplace.</w:t>
-      </w:r>
-    </w:p>
-    <w:p>
-      <w:pPr>
-        <w:pStyle w:val="ListParagraph"/>
-        <w:numPr>
-          <w:ilvl w:val="0"/>
-          <w:numId w:val="2"/>
-        </w:numPr>
-        <w:spacing w:after="0" w:before="0" w:line="264" w:lineRule="auto"/>
-      </w:pPr>
-      <w:r>
-        <w:rPr>
-          <w:b/>
-          <w:bCs/>
-        </w:rPr>
-        <w:t xml:space="preserve">3.1.4 Governance Rights: </w:t>
-      </w:r>
-      <w:r>
-        <w:t xml:space="preserve">Holders could vote on collaborations, investments, and strategic decisions.</w:t>
-      </w:r>
-    </w:p>
-    <w:p>
-      <w:pPr>
-        <w:pStyle w:val="ListParagraph"/>
-        <w:numPr>
-          <w:ilvl w:val="0"/>
-          <w:numId w:val="2"/>
-        </w:numPr>
-        <w:spacing w:after="120" w:before="0" w:line="264" w:lineRule="auto"/>
-      </w:pPr>
-      <w:r>
-        <w:rPr>
-          <w:b/>
-          <w:bCs/>
-        </w:rPr>
-        <w:t xml:space="preserve">3.1.5 Redeem, Hold or Trade: </w:t>
-      </w:r>
-      <w:r>
-        <w:t xml:space="preserve">Partners could redeem coins for team services, hold them for perks and profit share, or trade them.</w:t>
+        <w:t xml:space="preserve">5. Performance Analysis &amp; Lessons Learned</w:t>
       </w:r>
     </w:p>
     <w:p>
@@ -1016,87 +1056,67 @@
         <w:spacing w:after="120" w:before="0" w:line="264" w:lineRule="auto"/>
       </w:pPr>
       <w:r>
-        <w:t xml:space="preserve">3.2 Token Supply &amp; Allocation</w:t>
-      </w:r>
-    </w:p>
-    <w:p>
-      <w:pPr>
-        <w:pStyle w:val="ListParagraph"/>
-        <w:numPr>
-          <w:ilvl w:val="0"/>
-          <w:numId w:val="2"/>
-        </w:numPr>
-        <w:spacing w:after="0" w:before="0" w:line="264" w:lineRule="auto"/>
-      </w:pPr>
-      <w:r>
-        <w:rPr>
-          <w:b/>
-          <w:bCs/>
-        </w:rPr>
-        <w:t xml:space="preserve">3.2.1 Total Supply: </w:t>
-      </w:r>
-      <w:r>
-        <w:t xml:space="preserve">10,000 ICs, collectively holding 10% of Team Inferno's profits from collaborative projects, with an initial value of Rs. 50 per coin. At this price, the full supply carried a notional value of Rs. 5,00,000.</w:t>
-      </w:r>
-    </w:p>
-    <w:p>
-      <w:pPr>
-        <w:pStyle w:val="ListParagraph"/>
-        <w:numPr>
-          <w:ilvl w:val="0"/>
-          <w:numId w:val="2"/>
-        </w:numPr>
-        <w:spacing w:after="0" w:before="0" w:line="264" w:lineRule="auto"/>
-      </w:pPr>
-      <w:r>
-        <w:rPr>
-          <w:b/>
-          <w:bCs/>
-        </w:rPr>
-        <w:t xml:space="preserve">3.2.2 Collaborative Profit Sharing (35%): </w:t>
-      </w:r>
-      <w:r>
-        <w:t xml:space="preserve">Reserved for partners in R&amp;D collaborations, to incentivize success through profit-sharing opportunities.</w:t>
-      </w:r>
-    </w:p>
-    <w:p>
-      <w:pPr>
-        <w:pStyle w:val="ListParagraph"/>
-        <w:numPr>
-          <w:ilvl w:val="0"/>
-          <w:numId w:val="2"/>
-        </w:numPr>
-        <w:spacing w:after="0" w:before="0" w:line="264" w:lineRule="auto"/>
-      </w:pPr>
-      <w:r>
-        <w:rPr>
-          <w:b/>
-          <w:bCs/>
-        </w:rPr>
-        <w:t xml:space="preserve">3.2.3 Investment Pool (14%): </w:t>
-      </w:r>
-      <w:r>
-        <w:t xml:space="preserve">Dedicated to funding innovative projects, technology acquisition, and strategic investments in emerging markets.</w:t>
-      </w:r>
-    </w:p>
-    <w:p>
-      <w:pPr>
-        <w:pStyle w:val="ListParagraph"/>
-        <w:numPr>
-          <w:ilvl w:val="0"/>
-          <w:numId w:val="2"/>
-        </w:numPr>
-        <w:spacing w:after="120" w:before="0" w:line="264" w:lineRule="auto"/>
-      </w:pPr>
-      <w:r>
-        <w:rPr>
-          <w:b/>
-          <w:bCs/>
-        </w:rPr>
-        <w:t xml:space="preserve">3.2.4 Team Reserve &amp; Governance (51%): </w:t>
-      </w:r>
-      <w:r>
-        <w:t xml:space="preserve">Retained by the team to keep majority control, fund operations, and maintain flexibility for future growth.</w:t>
+        <w:t xml:space="preserve">5.1 Strengths</w:t>
+      </w:r>
+    </w:p>
+    <w:p>
+      <w:pPr>
+        <w:pStyle w:val="ListParagraph"/>
+        <w:numPr>
+          <w:ilvl w:val="0"/>
+          <w:numId w:val="2"/>
+        </w:numPr>
+        <w:spacing w:after="0" w:before="0" w:line="264" w:lineRule="auto"/>
+      </w:pPr>
+      <w:r>
+        <w:rPr>
+          <w:b/>
+          <w:bCs/>
+        </w:rPr>
+        <w:t xml:space="preserve">5.1.1 Financial Depth: </w:t>
+      </w:r>
+      <w:r>
+        <w:t xml:space="preserve">A fully quantified model covering supply, pricing, allocation, issuance, and redemption.</w:t>
+      </w:r>
+    </w:p>
+    <w:p>
+      <w:pPr>
+        <w:pStyle w:val="ListParagraph"/>
+        <w:numPr>
+          <w:ilvl w:val="0"/>
+          <w:numId w:val="2"/>
+        </w:numPr>
+        <w:spacing w:after="0" w:before="0" w:line="264" w:lineRule="auto"/>
+      </w:pPr>
+      <w:r>
+        <w:rPr>
+          <w:b/>
+          <w:bCs/>
+        </w:rPr>
+        <w:t xml:space="preserve">5.1.2 Layered Partner Value: </w:t>
+      </w:r>
+      <w:r>
+        <w:t xml:space="preserve">Profit share, services, discounts, and governance gave partners several reasons to engage.</w:t>
+      </w:r>
+    </w:p>
+    <w:p>
+      <w:pPr>
+        <w:pStyle w:val="ListParagraph"/>
+        <w:numPr>
+          <w:ilvl w:val="0"/>
+          <w:numId w:val="2"/>
+        </w:numPr>
+        <w:spacing w:after="120" w:before="0" w:line="264" w:lineRule="auto"/>
+      </w:pPr>
+      <w:r>
+        <w:rPr>
+          <w:b/>
+          <w:bCs/>
+        </w:rPr>
+        <w:t xml:space="preserve">5.1.3 Proof of Execution: </w:t>
+      </w:r>
+      <w:r>
+        <w:t xml:space="preserve">The website, campaign, and alliance plan showed concrete outreach work alongside the concept.</w:t>
       </w:r>
     </w:p>
     <w:p>
@@ -1106,599 +1126,73 @@
         <w:spacing w:after="120" w:before="0" w:line="264" w:lineRule="auto"/>
       </w:pPr>
       <w:r>
-        <w:t xml:space="preserve">3.3 Issuance &amp; Profit-Sharing Logic</w:t>
-      </w:r>
-    </w:p>
-    <w:p>
-      <w:pPr>
-        <w:pStyle w:val="ListParagraph"/>
-        <w:numPr>
-          <w:ilvl w:val="0"/>
-          <w:numId w:val="2"/>
-        </w:numPr>
-        <w:spacing w:after="0" w:before="0" w:line="264" w:lineRule="auto"/>
-      </w:pPr>
-      <w:r>
-        <w:rPr>
-          <w:b/>
-          <w:bCs/>
-        </w:rPr>
-        <w:t xml:space="preserve">3.3.1 Coin Award Formula: </w:t>
-      </w:r>
-      <w:r>
-        <w:t xml:space="preserve">The number of ICs awarded to a partner was defined as (Contribution Value C / Total Contributions in Pool T) × (1 / Workload Weight W) × (1 / Value of 1 IC V) × Token Pool P.</w:t>
-      </w:r>
-    </w:p>
-    <w:p>
-      <w:pPr>
-        <w:pStyle w:val="ListParagraph"/>
-        <w:numPr>
-          <w:ilvl w:val="0"/>
-          <w:numId w:val="2"/>
-        </w:numPr>
-        <w:spacing w:after="0" w:before="0" w:line="264" w:lineRule="auto"/>
-      </w:pPr>
-      <w:r>
-        <w:rPr>
-          <w:b/>
-          <w:bCs/>
-        </w:rPr>
-        <w:t xml:space="preserve">3.3.2 Profit Share Formula: </w:t>
-      </w:r>
-      <w:r>
-        <w:t xml:space="preserve">The profit percentage a partner could request was defined as (Workload Weight W / Collaborator Effect E) × Base Percentage B.</w:t>
-      </w:r>
-    </w:p>
-    <w:p>
-      <w:pPr>
-        <w:pStyle w:val="ListParagraph"/>
-        <w:numPr>
-          <w:ilvl w:val="0"/>
-          <w:numId w:val="2"/>
-        </w:numPr>
-        <w:spacing w:after="120" w:before="0" w:line="264" w:lineRule="auto"/>
-      </w:pPr>
-      <w:r>
-        <w:rPr>
-          <w:b/>
-          <w:bCs/>
-        </w:rPr>
-        <w:t xml:space="preserve">3.3.3 Project Linkage: </w:t>
-      </w:r>
-      <w:r>
-        <w:t xml:space="preserve">The number of ICs offered on a collaborative project was set equal to the percentage of profit requested, linking coin issuance directly to profit share.</w:t>
+        <w:t xml:space="preserve">5.2 Performance Issues</w:t>
+      </w:r>
+    </w:p>
+    <w:p>
+      <w:pPr>
+        <w:pStyle w:val="ListParagraph"/>
+        <w:numPr>
+          <w:ilvl w:val="0"/>
+          <w:numId w:val="2"/>
+        </w:numPr>
+        <w:spacing w:after="0" w:before="0" w:line="264" w:lineRule="auto"/>
+      </w:pPr>
+      <w:r>
+        <w:rPr>
+          <w:b/>
+          <w:bCs/>
+        </w:rPr>
+        <w:t xml:space="preserve">5.2.1 Standalone Asset: </w:t>
+      </w:r>
+      <w:r>
+        <w:t xml:space="preserve">We did not define how the coin would be issued, traded, or valued in practice, or how project profits would be measured and paid out. The IC lacked a real-world application for sponsors.</w:t>
+      </w:r>
+    </w:p>
+    <w:p>
+      <w:pPr>
+        <w:pStyle w:val="ListParagraph"/>
+        <w:numPr>
+          <w:ilvl w:val="0"/>
+          <w:numId w:val="2"/>
+        </w:numPr>
+        <w:spacing w:after="0" w:before="0" w:line="264" w:lineRule="auto"/>
+      </w:pPr>
+      <w:r>
+        <w:rPr>
+          <w:b/>
+          <w:bCs/>
+        </w:rPr>
+        <w:t xml:space="preserve">5.2.2 Unproven Model: </w:t>
+      </w:r>
+      <w:r>
+        <w:t xml:space="preserve">Key formula inputs were never quantified, and we did not show a worked example of a sponsor's contribution turning into coins and returns.</w:t>
+      </w:r>
+    </w:p>
+    <w:p>
+      <w:pPr>
+        <w:pStyle w:val="ListParagraph"/>
+        <w:numPr>
+          <w:ilvl w:val="0"/>
+          <w:numId w:val="2"/>
+        </w:numPr>
+        <w:spacing w:after="120" w:before="0" w:line="264" w:lineRule="auto"/>
+      </w:pPr>
+      <w:r>
+        <w:rPr>
+          <w:b/>
+          <w:bCs/>
+        </w:rPr>
+        <w:t xml:space="preserve">5.2.3 Broad Targeting: </w:t>
+      </w:r>
+      <w:r>
+        <w:t xml:space="preserve">Our target segments were not tied to specific industries or prospective sponsors.</w:t>
       </w:r>
     </w:p>
     <w:p>
       <w:pPr>
         <w:pStyle w:val="Heading2"/>
         <w:keepNext/>
-        <w:spacing w:after="200" w:before="0" w:line="264" w:lineRule="auto"/>
-      </w:pPr>
-      <w:r>
-        <w:t xml:space="preserve">3.4 Redeemable Services</w:t>
-      </w:r>
-    </w:p>
-    <w:p>
-      <w:pPr>
-        <w:spacing w:after="120" w:before="0" w:line="264" w:lineRule="auto"/>
-      </w:pPr>
-      <w:r>
-        <w:t xml:space="preserve">Coins could be redeemed for services delivered by the team. Each service category carried a base value in rupees, payable in ICs. The equivalent number of coins at the initial value of Rs. 50 is noted in brackets.</w:t>
-      </w:r>
-    </w:p>
-    <w:p>
-      <w:pPr>
-        <w:pStyle w:val="ListParagraph"/>
-        <w:numPr>
-          <w:ilvl w:val="0"/>
-          <w:numId w:val="2"/>
-        </w:numPr>
-        <w:spacing w:after="0" w:before="0" w:line="264" w:lineRule="auto"/>
-      </w:pPr>
-      <w:r>
-        <w:rPr>
-          <w:b/>
-          <w:bCs/>
-        </w:rPr>
-        <w:t xml:space="preserve">3.4.1 Educational Resources: </w:t>
-      </w:r>
-      <w:r>
-        <w:t xml:space="preserve">Workshops, mentorship programs, and tailored training modules, at a base value of Rs. 5,000 (100 ICs).</w:t>
-      </w:r>
-    </w:p>
-    <w:p>
-      <w:pPr>
-        <w:pStyle w:val="ListParagraph"/>
-        <w:numPr>
-          <w:ilvl w:val="0"/>
-          <w:numId w:val="2"/>
-        </w:numPr>
-        <w:spacing w:after="0" w:before="0" w:line="264" w:lineRule="auto"/>
-      </w:pPr>
-      <w:r>
-        <w:rPr>
-          <w:b/>
-          <w:bCs/>
-        </w:rPr>
-        <w:t xml:space="preserve">3.4.2 Data and Analytics: </w:t>
-      </w:r>
-      <w:r>
-        <w:t xml:space="preserve">Data collection, analysis, predictive modeling, and system performance optimization, at Rs. 6,000 (120 ICs).</w:t>
-      </w:r>
-    </w:p>
-    <w:p>
-      <w:pPr>
-        <w:pStyle w:val="ListParagraph"/>
-        <w:numPr>
-          <w:ilvl w:val="0"/>
-          <w:numId w:val="2"/>
-        </w:numPr>
-        <w:spacing w:after="0" w:before="0" w:line="264" w:lineRule="auto"/>
-      </w:pPr>
-      <w:r>
-        <w:rPr>
-          <w:b/>
-          <w:bCs/>
-        </w:rPr>
-        <w:t xml:space="preserve">3.4.3 Design and Marketing: </w:t>
-      </w:r>
-      <w:r>
-        <w:t xml:space="preserve">UI/UX design, branding, content creation, and social media management, at Rs. 8,000 (160 ICs).</w:t>
-      </w:r>
-    </w:p>
-    <w:p>
-      <w:pPr>
-        <w:pStyle w:val="ListParagraph"/>
-        <w:numPr>
-          <w:ilvl w:val="0"/>
-          <w:numId w:val="2"/>
-        </w:numPr>
-        <w:spacing w:after="0" w:before="0" w:line="264" w:lineRule="auto"/>
-      </w:pPr>
-      <w:r>
-        <w:rPr>
-          <w:b/>
-          <w:bCs/>
-        </w:rPr>
-        <w:t xml:space="preserve">3.4.4 Promotional Services: </w:t>
-      </w:r>
-      <w:r>
-        <w:t xml:space="preserve">PR campaigns, event support, and social media strategy development, at Rs. 8,000 (160 ICs).</w:t>
-      </w:r>
-    </w:p>
-    <w:p>
-      <w:pPr>
-        <w:pStyle w:val="ListParagraph"/>
-        <w:numPr>
-          <w:ilvl w:val="0"/>
-          <w:numId w:val="2"/>
-        </w:numPr>
-        <w:spacing w:after="120" w:before="0" w:line="264" w:lineRule="auto"/>
-      </w:pPr>
-      <w:r>
-        <w:rPr>
-          <w:b/>
-          <w:bCs/>
-        </w:rPr>
-        <w:t xml:space="preserve">3.4.5 Value Proposition: </w:t>
-      </w:r>
-      <w:r>
-        <w:t xml:space="preserve">We justified redemption on three grounds: pricing that adjusts dynamically with the current IC value, exclusive access to a team of engineers skilled in robotics, data analytics, and design, and services tailored to each partner's project requirements.</w:t>
-      </w:r>
-    </w:p>
-    <w:p>
-      <w:pPr>
-        <w:pStyle w:val="Heading2"/>
-        <w:keepNext/>
-        <w:spacing w:after="120" w:before="0" w:line="264" w:lineRule="auto"/>
-      </w:pPr>
-      <w:r>
-        <w:t xml:space="preserve">3.5 Holder Perks &amp; Community Platform</w:t>
-      </w:r>
-    </w:p>
-    <w:p>
-      <w:pPr>
-        <w:pStyle w:val="ListParagraph"/>
-        <w:numPr>
-          <w:ilvl w:val="0"/>
-          <w:numId w:val="2"/>
-        </w:numPr>
-        <w:spacing w:after="0" w:before="0" w:line="264" w:lineRule="auto"/>
-      </w:pPr>
-      <w:r>
-        <w:rPr>
-          <w:b/>
-          <w:bCs/>
-        </w:rPr>
-        <w:t xml:space="preserve">3.5.1 Gold Tier: </w:t>
-      </w:r>
-      <w:r>
-        <w:t xml:space="preserve">Holdings of 700 to 1,000 ICs, carrying a 25% discount on all Team Inferno services.</w:t>
-      </w:r>
-    </w:p>
-    <w:p>
-      <w:pPr>
-        <w:pStyle w:val="ListParagraph"/>
-        <w:numPr>
-          <w:ilvl w:val="0"/>
-          <w:numId w:val="2"/>
-        </w:numPr>
-        <w:spacing w:after="0" w:before="0" w:line="264" w:lineRule="auto"/>
-      </w:pPr>
-      <w:r>
-        <w:rPr>
-          <w:b/>
-          <w:bCs/>
-        </w:rPr>
-        <w:t xml:space="preserve">3.5.2 Silver Tier: </w:t>
-      </w:r>
-      <w:r>
-        <w:t xml:space="preserve">Holdings of 400 to 700 ICs, carrying a 15% discount on all Team Inferno services.</w:t>
-      </w:r>
-    </w:p>
-    <w:p>
-      <w:pPr>
-        <w:pStyle w:val="ListParagraph"/>
-        <w:numPr>
-          <w:ilvl w:val="0"/>
-          <w:numId w:val="2"/>
-        </w:numPr>
-        <w:spacing w:after="0" w:before="0" w:line="264" w:lineRule="auto"/>
-      </w:pPr>
-      <w:r>
-        <w:rPr>
-          <w:b/>
-          <w:bCs/>
-        </w:rPr>
-        <w:t xml:space="preserve">3.5.3 Bronze Tier: </w:t>
-      </w:r>
-      <w:r>
-        <w:t xml:space="preserve">Holdings of 200 to 400 ICs, carrying a 10% discount on all Team Inferno services.</w:t>
-      </w:r>
-    </w:p>
-    <w:p>
-      <w:pPr>
-        <w:pStyle w:val="ListParagraph"/>
-        <w:numPr>
-          <w:ilvl w:val="0"/>
-          <w:numId w:val="2"/>
-        </w:numPr>
-        <w:spacing w:after="120" w:before="0" w:line="264" w:lineRule="auto"/>
-      </w:pPr>
-      <w:r>
-        <w:rPr>
-          <w:b/>
-          <w:bCs/>
-        </w:rPr>
-        <w:t xml:space="preserve">3.5.4 The Inferno Community Forum &amp; Trading Hub: </w:t>
-      </w:r>
-      <w:r>
-        <w:t xml:space="preserve">A proposed platform to bring the ecosystem together. It combined networking with innovators and investors and opportunities for co-investment, a transparent marketplace with real-time token values and market analytics, and a governance channel for project updates and voting.</w:t>
-      </w:r>
-    </w:p>
-    <w:p>
-      <w:pPr>
-        <w:pStyle w:val="Heading1"/>
-        <w:keepNext/>
-        <w:spacing w:after="200" w:before="0" w:line="264" w:lineRule="auto"/>
-      </w:pPr>
-      <w:r>
-        <w:t xml:space="preserve">4. Supporting Corporate Deliverables</w:t>
-      </w:r>
-    </w:p>
-    <w:p>
-      <w:pPr>
-        <w:pStyle w:val="Heading2"/>
-        <w:keepNext/>
-        <w:spacing w:after="200" w:before="0" w:line="264" w:lineRule="auto"/>
-      </w:pPr>
-      <w:r>
-        <w:t xml:space="preserve">4.1 Other Tasks Completed</w:t>
-      </w:r>
-    </w:p>
-    <w:p>
-      <w:pPr>
-        <w:spacing w:after="120" w:before="0" w:line="264" w:lineRule="auto"/>
-      </w:pPr>
-      <w:r>
-        <w:t xml:space="preserve">The BPP closed with the corporate work completed alongside the plan, presented as evidence of our outreach capability.</w:t>
-      </w:r>
-    </w:p>
-    <w:p>
-      <w:pPr>
-        <w:pStyle w:val="ListParagraph"/>
-        <w:numPr>
-          <w:ilvl w:val="0"/>
-          <w:numId w:val="2"/>
-        </w:numPr>
-        <w:spacing w:after="0" w:before="0" w:line="264" w:lineRule="auto"/>
-      </w:pPr>
-      <w:r>
-        <w:rPr>
-          <w:b/>
-          <w:bCs/>
-        </w:rPr>
-        <w:t xml:space="preserve">4.1.1 Team Website (infernodtu.in): </w:t>
-      </w:r>
-      <w:r>
-        <w:t xml:space="preserve">A sponsor-facing website presenting Team Inferno as the Mars Rover Team of Delhi Technological University, led by the headline "Fuel the Future of Space Robotics with Team Inferno" and a "Partner With Us" call to action. It carried dedicated sections for our mission, the IRC, IRDC (International Rover Design Challenge) and ISDC (International Space Drone Challenge) competitions, the rover, achievements, sponsorship, and contact, along with upcoming competitions and team news.</w:t>
-      </w:r>
-    </w:p>
-    <w:p>
-      <w:pPr>
-        <w:pStyle w:val="ListParagraph"/>
-        <w:numPr>
-          <w:ilvl w:val="0"/>
-          <w:numId w:val="2"/>
-        </w:numPr>
-        <w:spacing w:after="0" w:before="0" w:line="264" w:lineRule="auto"/>
-      </w:pPr>
-      <w:r>
-        <w:rPr>
-          <w:b/>
-          <w:bCs/>
-        </w:rPr>
-        <w:t xml:space="preserve">4.1.2 Sponsor Showcase: </w:t>
-      </w:r>
-      <w:r>
-        <w:t xml:space="preserve">The website's sponsor section displayed our sponsors, including Ansys, SolidWorks, and India Circuits Pvt. Ltd.</w:t>
-      </w:r>
-    </w:p>
-    <w:p>
-      <w:pPr>
-        <w:pStyle w:val="ListParagraph"/>
-        <w:numPr>
-          <w:ilvl w:val="0"/>
-          <w:numId w:val="2"/>
-        </w:numPr>
-        <w:spacing w:after="0" w:before="0" w:line="264" w:lineRule="auto"/>
-      </w:pPr>
-      <w:r>
-        <w:rPr>
-          <w:b/>
-          <w:bCs/>
-        </w:rPr>
-        <w:t xml:space="preserve">4.1.3 Social Media Creatives: </w:t>
-      </w:r>
-      <w:r>
-        <w:t xml:space="preserve">A three-post "Ready for IRC 2025" grid pinned to the team's social media profile, carrying both the Space Robotics Society and Team Inferno marks.</w:t>
-      </w:r>
-    </w:p>
-    <w:p>
-      <w:pPr>
-        <w:pStyle w:val="ListParagraph"/>
-        <w:numPr>
-          <w:ilvl w:val="0"/>
-          <w:numId w:val="2"/>
-        </w:numPr>
-        <w:spacing w:after="120" w:before="0" w:line="264" w:lineRule="auto"/>
-      </w:pPr>
-      <w:r>
-        <w:rPr>
-          <w:b/>
-          <w:bCs/>
-        </w:rPr>
-        <w:t xml:space="preserve">4.1.4 Strategic Alliance Plan: </w:t>
-      </w:r>
-      <w:r>
-        <w:t xml:space="preserve">A branded Team Inferno DTU partnership document supporting our sponsorship outreach.</w:t>
-      </w:r>
-    </w:p>
-    <w:p>
-      <w:pPr>
-        <w:pStyle w:val="Heading1"/>
-        <w:keepNext/>
-        <w:spacing w:after="200" w:before="0" w:line="264" w:lineRule="auto"/>
-      </w:pPr>
-      <w:r>
-        <w:t xml:space="preserve">5. Performance Analysis &amp; Lessons Learned</w:t>
-      </w:r>
-    </w:p>
-    <w:p>
-      <w:pPr>
-        <w:pStyle w:val="Heading2"/>
-        <w:keepNext/>
-        <w:spacing w:after="120" w:before="0" w:line="264" w:lineRule="auto"/>
-      </w:pPr>
-      <w:r>
-        <w:t xml:space="preserve">5.1 Strengths</w:t>
-      </w:r>
-    </w:p>
-    <w:p>
-      <w:pPr>
-        <w:pStyle w:val="ListParagraph"/>
-        <w:numPr>
-          <w:ilvl w:val="0"/>
-          <w:numId w:val="2"/>
-        </w:numPr>
-        <w:spacing w:after="0" w:before="0" w:line="264" w:lineRule="auto"/>
-      </w:pPr>
-      <w:r>
-        <w:rPr>
-          <w:b/>
-          <w:bCs/>
-        </w:rPr>
-        <w:t xml:space="preserve">5.1.1 Quantified Financial Model: </w:t>
-      </w:r>
-      <w:r>
-        <w:t xml:space="preserve">The plan defined a fixed supply, an initial price, a complete allocation summing to 100%, and formulas for issuance and profit share, giving the BPP a level of financial depth beyond a conventional sponsorship pitch.</w:t>
-      </w:r>
-    </w:p>
-    <w:p>
-      <w:pPr>
-        <w:pStyle w:val="ListParagraph"/>
-        <w:numPr>
-          <w:ilvl w:val="0"/>
-          <w:numId w:val="2"/>
-        </w:numPr>
-        <w:spacing w:after="0" w:before="0" w:line="264" w:lineRule="auto"/>
-      </w:pPr>
-      <w:r>
-        <w:rPr>
-          <w:b/>
-          <w:bCs/>
-        </w:rPr>
-        <w:t xml:space="preserve">5.1.2 Layered Value for Partners: </w:t>
-      </w:r>
-      <w:r>
-        <w:t xml:space="preserve">Partners were offered several reasons to hold ICs at once: a share of collaborative profits, redeemable services, tiered discounts, and governance rights.</w:t>
-      </w:r>
-    </w:p>
-    <w:p>
-      <w:pPr>
-        <w:pStyle w:val="ListParagraph"/>
-        <w:numPr>
-          <w:ilvl w:val="0"/>
-          <w:numId w:val="2"/>
-        </w:numPr>
-        <w:spacing w:after="0" w:before="0" w:line="264" w:lineRule="auto"/>
-      </w:pPr>
-      <w:r>
-        <w:rPr>
-          <w:b/>
-          <w:bCs/>
-        </w:rPr>
-        <w:t xml:space="preserve">5.1.3 Retained Team Control: </w:t>
-      </w:r>
-      <w:r>
-        <w:t xml:space="preserve">The 51% reserve ensured that Team Inferno kept majority control over the ecosystem and its decisions.</w:t>
-      </w:r>
-    </w:p>
-    <w:p>
-      <w:pPr>
-        <w:pStyle w:val="ListParagraph"/>
-        <w:numPr>
-          <w:ilvl w:val="0"/>
-          <w:numId w:val="2"/>
-        </w:numPr>
-        <w:spacing w:after="120" w:before="0" w:line="264" w:lineRule="auto"/>
-      </w:pPr>
-      <w:r>
-        <w:rPr>
-          <w:b/>
-          <w:bCs/>
-        </w:rPr>
-        <w:t xml:space="preserve">5.1.4 Evidence of Execution: </w:t>
-      </w:r>
-      <w:r>
-        <w:t xml:space="preserve">The website, social media creatives, and Strategic Alliance Plan demonstrated that the corporate department was delivering concrete outreach assets alongside the concept.</w:t>
-      </w:r>
-    </w:p>
-    <w:p>
-      <w:pPr>
-        <w:pStyle w:val="Heading2"/>
-        <w:keepNext/>
-        <w:spacing w:after="120" w:before="0" w:line="264" w:lineRule="auto"/>
-      </w:pPr>
-      <w:r>
-        <w:t xml:space="preserve">5.2 Performance &amp; Presentation Issues</w:t>
-      </w:r>
-    </w:p>
-    <w:p>
-      <w:pPr>
-        <w:pStyle w:val="ListParagraph"/>
-        <w:numPr>
-          <w:ilvl w:val="0"/>
-          <w:numId w:val="2"/>
-        </w:numPr>
-        <w:spacing w:after="0" w:before="0" w:line="264" w:lineRule="auto"/>
-      </w:pPr>
-      <w:r>
-        <w:rPr>
-          <w:b/>
-          <w:bCs/>
-        </w:rPr>
-        <w:t xml:space="preserve">5.2.1 Standalone Asset: </w:t>
-      </w:r>
-      <w:r>
-        <w:t xml:space="preserve">The IC remained a standalone digital asset. The deck did not specify the platform on which coins would be issued, traded, or valued, or how profits from collaborative projects would be measured and distributed to holders. As a result, the coin lacked a fully integrated, real-world application for sponsors.</w:t>
-      </w:r>
-    </w:p>
-    <w:p>
-      <w:pPr>
-        <w:pStyle w:val="ListParagraph"/>
-        <w:numPr>
-          <w:ilvl w:val="0"/>
-          <w:numId w:val="2"/>
-        </w:numPr>
-        <w:spacing w:after="0" w:before="0" w:line="264" w:lineRule="auto"/>
-      </w:pPr>
-      <w:r>
-        <w:rPr>
-          <w:b/>
-          <w:bCs/>
-        </w:rPr>
-        <w:t xml:space="preserve">5.2.2 Undefined Model Inputs: </w:t>
-      </w:r>
-      <w:r>
-        <w:t xml:space="preserve">Workload Weight, Collaborator Effect, Base Percentage, and Token Pool were named but never quantified, and no worked example showed how a partner's contribution converts into coins or a profit share. The coin award formula also applies both a share of the token pool and a division by coin value, so its units are unclear without a worked example.</w:t>
-      </w:r>
-    </w:p>
-    <w:p>
-      <w:pPr>
-        <w:pStyle w:val="ListParagraph"/>
-        <w:numPr>
-          <w:ilvl w:val="0"/>
-          <w:numId w:val="2"/>
-        </w:numPr>
-        <w:spacing w:after="0" w:before="0" w:line="264" w:lineRule="auto"/>
-      </w:pPr>
-      <w:r>
-        <w:rPr>
-          <w:b/>
-          <w:bCs/>
-        </w:rPr>
-        <w:t xml:space="preserve">5.2.3 Overlapping Tier Ranges: </w:t>
-      </w:r>
-      <w:r>
-        <w:t xml:space="preserve">The Gold and Silver tiers both included 700 ICs, and the Silver and Bronze tiers both included 400 ICs, leaving the applicable discount at those holdings unclear.</w:t>
-      </w:r>
-    </w:p>
-    <w:p>
-      <w:pPr>
-        <w:pStyle w:val="ListParagraph"/>
-        <w:numPr>
-          <w:ilvl w:val="0"/>
-          <w:numId w:val="2"/>
-        </w:numPr>
-        <w:spacing w:after="0" w:before="0" w:line="264" w:lineRule="auto"/>
-      </w:pPr>
-      <w:r>
-        <w:rPr>
-          <w:b/>
-          <w:bCs/>
-        </w:rPr>
-        <w:t xml:space="preserve">5.2.4 Visual Execution: </w:t>
-      </w:r>
-      <w:r>
-        <w:t xml:space="preserve">The aesthetic of the deck was casual for a corporate pitch, relying on clip-art icons and pushpin graphics. A single slide carried the token allocation, issuance formulas, redeemable services, holder perks, and community platform, and three of its content boxes still displayed visible Canva watermarks. The "Other Tasks Completed" slide used raw screenshots, one of which captured the browser interface while another was too low in resolution to read.</w:t>
-      </w:r>
-    </w:p>
-    <w:p>
-      <w:pPr>
-        <w:pStyle w:val="ListParagraph"/>
-        <w:numPr>
-          <w:ilvl w:val="0"/>
-          <w:numId w:val="2"/>
-        </w:numPr>
-        <w:spacing w:after="120" w:before="0" w:line="264" w:lineRule="auto"/>
-      </w:pPr>
-      <w:r>
-        <w:rPr>
-          <w:b/>
-          <w:bCs/>
-        </w:rPr>
-        <w:t xml:space="preserve">5.2.5 Unmapped Target Segments: </w:t>
-      </w:r>
-      <w:r>
-        <w:t xml:space="preserve">The three target company segments were named but not linked to specific industries, prospective partners, or tailored offers.</w:t>
-      </w:r>
-    </w:p>
-    <w:p>
-      <w:pPr>
-        <w:pStyle w:val="Heading2"/>
-        <w:keepNext/>
         <w:spacing w:after="120" w:before="0" w:line="264" w:lineRule="auto"/>
       </w:pPr>
       <w:r>
@@ -1719,70 +1213,50 @@
           <w:b/>
           <w:bCs/>
         </w:rPr>
-        <w:t xml:space="preserve">5.3.1 Real-World Integration: </w:t>
-      </w:r>
-      <w:r>
-        <w:t xml:space="preserve">A token concept must sit within an ecosystem where sponsors actively exchange services and funds with the team. This lesson led directly to the Inferno Exchange in the following cycle.</w:t>
-      </w:r>
-    </w:p>
-    <w:p>
-      <w:pPr>
-        <w:pStyle w:val="ListParagraph"/>
-        <w:numPr>
-          <w:ilvl w:val="0"/>
-          <w:numId w:val="2"/>
-        </w:numPr>
-        <w:spacing w:after="0" w:before="0" w:line="264" w:lineRule="auto"/>
-      </w:pPr>
-      <w:r>
-        <w:rPr>
-          <w:b/>
-          <w:bCs/>
-        </w:rPr>
-        <w:t xml:space="preserve">5.3.2 Demonstrate the Numbers: </w:t>
-      </w:r>
-      <w:r>
-        <w:t xml:space="preserve">Financial models must define every variable and include a worked example of a sponsor's journey, from contribution to coins to returns.</w:t>
-      </w:r>
-    </w:p>
-    <w:p>
-      <w:pPr>
-        <w:pStyle w:val="ListParagraph"/>
-        <w:numPr>
-          <w:ilvl w:val="0"/>
-          <w:numId w:val="2"/>
-        </w:numPr>
-        <w:spacing w:after="0" w:before="0" w:line="264" w:lineRule="auto"/>
-      </w:pPr>
-      <w:r>
-        <w:rPr>
-          <w:b/>
-          <w:bCs/>
-        </w:rPr>
-        <w:t xml:space="preserve">5.3.3 Consistency Review: </w:t>
-      </w:r>
-      <w:r>
-        <w:t xml:space="preserve">All tables and tier structures must be checked for gaps and overlaps before submission.</w:t>
-      </w:r>
-    </w:p>
-    <w:p>
-      <w:pPr>
-        <w:pStyle w:val="ListParagraph"/>
-        <w:numPr>
-          <w:ilvl w:val="0"/>
-          <w:numId w:val="2"/>
-        </w:numPr>
-        <w:spacing w:after="0" w:before="0" w:line="264" w:lineRule="auto"/>
-      </w:pPr>
-      <w:r>
-        <w:rPr>
-          <w:b/>
-          <w:bCs/>
-        </w:rPr>
-        <w:t xml:space="preserve">5.3.4 Professional Visual Standards: </w:t>
-      </w:r>
-      <w:r>
-        <w:t xml:space="preserve">Pitch decks must be free of watermarks, use high-resolution assets, and limit each slide to one core idea, in line with the formal brand identity adopted in the 2026 overhaul.</w:t>
+        <w:t xml:space="preserve">5.3.1 Build a Working Ecosystem: </w:t>
+      </w:r>
+      <w:r>
+        <w:t xml:space="preserve">The coin needed a practical system in which sponsors actively exchange services and funds with us, which led to the Inferno Exchange.</w:t>
+      </w:r>
+    </w:p>
+    <w:p>
+      <w:pPr>
+        <w:pStyle w:val="ListParagraph"/>
+        <w:numPr>
+          <w:ilvl w:val="0"/>
+          <w:numId w:val="2"/>
+        </w:numPr>
+        <w:spacing w:after="0" w:before="0" w:line="264" w:lineRule="auto"/>
+      </w:pPr>
+      <w:r>
+        <w:rPr>
+          <w:b/>
+          <w:bCs/>
+        </w:rPr>
+        <w:t xml:space="preserve">5.3.2 Show the Model Working: </w:t>
+      </w:r>
+      <w:r>
+        <w:t xml:space="preserve">Every variable must be defined, with a clear walkthrough of a sponsor's journey from contribution to return.</w:t>
+      </w:r>
+    </w:p>
+    <w:p>
+      <w:pPr>
+        <w:pStyle w:val="ListParagraph"/>
+        <w:numPr>
+          <w:ilvl w:val="0"/>
+          <w:numId w:val="2"/>
+        </w:numPr>
+        <w:spacing w:after="0" w:before="0" w:line="264" w:lineRule="auto"/>
+      </w:pPr>
+      <w:r>
+        <w:rPr>
+          <w:b/>
+          <w:bCs/>
+        </w:rPr>
+        <w:t xml:space="preserve">5.3.3 Target Specific Partners: </w:t>
+      </w:r>
+      <w:r>
+        <w:t xml:space="preserve">Each segment must be mapped to concrete industries and prospective sponsors.</w:t>
       </w:r>
     </w:p>
     <w:sectPr>

</xml_diff>

<commit_message>
Added PIMA IRC 2025 Report
</commit_message>
<xml_diff>
--- a/Team Inferno Corporate Report.docx
+++ b/Team Inferno Corporate Report.docx
@@ -1257,6 +1257,594 @@
       </w:r>
       <w:r>
         <w:t xml:space="preserve">Each segment must be mapped to concrete industries and prospective sponsors.</w:t>
+      </w:r>
+    </w:p>
+    <w:p>
+      <w:pPr>
+        <w:pStyle w:val="Title"/>
+        <w:keepNext/>
+        <w:pageBreakBefore/>
+        <w:spacing w:after="120" w:before="0" w:line="264" w:lineRule="auto"/>
+        <w:jc w:val="center"/>
+      </w:pPr>
+      <w:r>
+        <w:t xml:space="preserve">PIMA IRC 2025</w:t>
+      </w:r>
+    </w:p>
+    <w:p>
+      <w:pPr>
+        <w:pStyle w:val="Heading1"/>
+        <w:keepNext/>
+        <w:spacing w:after="200" w:before="0" w:line="264" w:lineRule="auto"/>
+      </w:pPr>
+      <w:r>
+        <w:t xml:space="preserve">1. Executive Overview</w:t>
+      </w:r>
+    </w:p>
+    <w:p>
+      <w:pPr>
+        <w:spacing w:after="200" w:before="0" w:line="264" w:lineRule="auto"/>
+      </w:pPr>
+      <w:r>
+        <w:t xml:space="preserve">For IRC 2025, our PIMA traced the transition from NAMBI 2.0 to ARŌHN. We identified four key setbacks in NAMBI 2.0 and presented our solutions under three pillars: members, monetary resources, and innovative engineering. The presentation showed clear corporate progress, with sponsorship rising from 28% to 43% of our funding and our social media reaching 100K accounts in 90 days. However, it lacked a project timeline, absolute budget figures, and test results for our technical solutions.</w:t>
+      </w:r>
+    </w:p>
+    <w:p>
+      <w:pPr>
+        <w:pStyle w:val="Heading1"/>
+        <w:keepNext/>
+        <w:spacing w:after="200" w:before="0" w:line="264" w:lineRule="auto"/>
+      </w:pPr>
+      <w:r>
+        <w:t xml:space="preserve">2. Members: Team Management</w:t>
+      </w:r>
+    </w:p>
+    <w:p>
+      <w:pPr>
+        <w:pStyle w:val="Heading2"/>
+        <w:keepNext/>
+        <w:spacing w:after="120" w:before="0" w:line="264" w:lineRule="auto"/>
+      </w:pPr>
+      <w:r>
+        <w:t xml:space="preserve">2.1 Team Structure &amp; Workflow</w:t>
+      </w:r>
+    </w:p>
+    <w:p>
+      <w:pPr>
+        <w:pStyle w:val="ListParagraph"/>
+        <w:numPr>
+          <w:ilvl w:val="0"/>
+          <w:numId w:val="2"/>
+        </w:numPr>
+        <w:spacing w:after="0" w:before="0" w:line="264" w:lineRule="auto"/>
+      </w:pPr>
+      <w:r>
+        <w:rPr>
+          <w:b/>
+          <w:bCs/>
+        </w:rPr>
+        <w:t xml:space="preserve">2.1.1 Operational Cycle: </w:t>
+      </w:r>
+      <w:r>
+        <w:t xml:space="preserve">Three months of training followed by R&amp;D in the first year, hands-on rover expertise after one year, and leadership roles after two years, followed by POR assignments and fresh recruitment.</w:t>
+      </w:r>
+    </w:p>
+    <w:p>
+      <w:pPr>
+        <w:pStyle w:val="ListParagraph"/>
+        <w:numPr>
+          <w:ilvl w:val="0"/>
+          <w:numId w:val="2"/>
+        </w:numPr>
+        <w:spacing w:after="120" w:before="0" w:line="264" w:lineRule="auto"/>
+      </w:pPr>
+      <w:r>
+        <w:rPr>
+          <w:b/>
+          <w:bCs/>
+        </w:rPr>
+        <w:t xml:space="preserve">2.1.2 Project Management: </w:t>
+      </w:r>
+      <w:r>
+        <w:t xml:space="preserve">Jira for priority-based deadlines, phase timelines, and cross-department progress tracking, supported by weekly team reviews.</w:t>
+      </w:r>
+    </w:p>
+    <w:p>
+      <w:pPr>
+        <w:pStyle w:val="Heading1"/>
+        <w:keepNext/>
+        <w:spacing w:after="200" w:before="0" w:line="264" w:lineRule="auto"/>
+      </w:pPr>
+      <w:r>
+        <w:t xml:space="preserve">3. Monetary Resources: Corporate Operations</w:t>
+      </w:r>
+    </w:p>
+    <w:p>
+      <w:pPr>
+        <w:spacing w:after="200" w:before="0" w:line="264" w:lineRule="auto"/>
+      </w:pPr>
+      <w:r>
+        <w:t xml:space="preserve">We presented the lack of monetary resources as "our beautiful constraint" and addressed it through an overhaul of our corporate operations.</w:t>
+      </w:r>
+    </w:p>
+    <w:p>
+      <w:pPr>
+        <w:pStyle w:val="Heading2"/>
+        <w:keepNext/>
+        <w:spacing w:after="120" w:before="0" w:line="264" w:lineRule="auto"/>
+      </w:pPr>
+      <w:r>
+        <w:t xml:space="preserve">3.1 Corporate Overhaul</w:t>
+      </w:r>
+    </w:p>
+    <w:p>
+      <w:pPr>
+        <w:pStyle w:val="ListParagraph"/>
+        <w:numPr>
+          <w:ilvl w:val="0"/>
+          <w:numId w:val="2"/>
+        </w:numPr>
+        <w:spacing w:after="0" w:before="0" w:line="264" w:lineRule="auto"/>
+      </w:pPr>
+      <w:r>
+        <w:rPr>
+          <w:b/>
+          <w:bCs/>
+        </w:rPr>
+        <w:t xml:space="preserve">3.1.1 Target Partners: </w:t>
+      </w:r>
+      <w:r>
+        <w:t xml:space="preserve">CSR initiatives, innovation-driven startups, student-focused organizations, and alumni-driven networks, approached through cold calling, emailing, and direct outreach.</w:t>
+      </w:r>
+    </w:p>
+    <w:p>
+      <w:pPr>
+        <w:pStyle w:val="ListParagraph"/>
+        <w:numPr>
+          <w:ilvl w:val="0"/>
+          <w:numId w:val="2"/>
+        </w:numPr>
+        <w:spacing w:after="0" w:before="0" w:line="264" w:lineRule="auto"/>
+      </w:pPr>
+      <w:r>
+        <w:rPr>
+          <w:b/>
+          <w:bCs/>
+        </w:rPr>
+        <w:t xml:space="preserve">3.1.2 Our Offering: </w:t>
+      </w:r>
+      <w:r>
+        <w:t xml:space="preserve">Hosting of and participation in events and seminars, and social media outreach.</w:t>
+      </w:r>
+    </w:p>
+    <w:p>
+      <w:pPr>
+        <w:pStyle w:val="ListParagraph"/>
+        <w:numPr>
+          <w:ilvl w:val="0"/>
+          <w:numId w:val="2"/>
+        </w:numPr>
+        <w:spacing w:after="120" w:before="0" w:line="264" w:lineRule="auto"/>
+      </w:pPr>
+      <w:r>
+        <w:rPr>
+          <w:b/>
+          <w:bCs/>
+        </w:rPr>
+        <w:t xml:space="preserve">3.1.3 Outreach &amp; Reach: </w:t>
+      </w:r>
+      <w:r>
+        <w:t xml:space="preserve">School outreach, rover demonstrations, and seminars, with 100K accounts reached on inferno.dtu in the last 90 days.</w:t>
+      </w:r>
+    </w:p>
+    <w:p>
+      <w:pPr>
+        <w:pStyle w:val="Heading2"/>
+        <w:keepNext/>
+        <w:spacing w:after="120" w:before="0" w:line="264" w:lineRule="auto"/>
+      </w:pPr>
+      <w:r>
+        <w:t xml:space="preserve">3.2 Funding &amp; Sponsors</w:t>
+      </w:r>
+    </w:p>
+    <w:p>
+      <w:pPr>
+        <w:pStyle w:val="ListParagraph"/>
+        <w:numPr>
+          <w:ilvl w:val="0"/>
+          <w:numId w:val="2"/>
+        </w:numPr>
+        <w:spacing w:after="0" w:before="0" w:line="264" w:lineRule="auto"/>
+      </w:pPr>
+      <w:r>
+        <w:rPr>
+          <w:b/>
+          <w:bCs/>
+        </w:rPr>
+        <w:t xml:space="preserve">3.2.1 Funding Mix: </w:t>
+      </w:r>
+      <w:r>
+        <w:t xml:space="preserve">Sponsorship rose from 28% to 43% of project funding between 2024 and 2025, while university funds fell from 67% to 55% and members' contributions from 5% to 2%.</w:t>
+      </w:r>
+    </w:p>
+    <w:p>
+      <w:pPr>
+        <w:pStyle w:val="ListParagraph"/>
+        <w:numPr>
+          <w:ilvl w:val="0"/>
+          <w:numId w:val="2"/>
+        </w:numPr>
+        <w:spacing w:after="120" w:before="0" w:line="264" w:lineRule="auto"/>
+      </w:pPr>
+      <w:r>
+        <w:rPr>
+          <w:b/>
+          <w:bCs/>
+        </w:rPr>
+        <w:t xml:space="preserve">3.2.2 Sponsors (FY 2024-25): </w:t>
+      </w:r>
+      <w:r>
+        <w:t xml:space="preserve">Ansys, NVIDIA, Altium, SolidWorks, Neutronium3D, Indian Circuits Pvt. Ltd., 69 Rigs, and SGR.</w:t>
+      </w:r>
+    </w:p>
+    <w:p>
+      <w:pPr>
+        <w:pStyle w:val="Heading1"/>
+        <w:keepNext/>
+        <w:spacing w:after="200" w:before="0" w:line="264" w:lineRule="auto"/>
+      </w:pPr>
+      <w:r>
+        <w:t xml:space="preserve">4. Innovative Engineering: Technical Solutions</w:t>
+      </w:r>
+    </w:p>
+    <w:p>
+      <w:pPr>
+        <w:pStyle w:val="Heading2"/>
+        <w:keepNext/>
+        <w:spacing w:after="120" w:before="0" w:line="264" w:lineRule="auto"/>
+      </w:pPr>
+      <w:r>
+        <w:t xml:space="preserve">4.1 Setbacks &amp; Solutions</w:t>
+      </w:r>
+    </w:p>
+    <w:p>
+      <w:pPr>
+        <w:pStyle w:val="ListParagraph"/>
+        <w:numPr>
+          <w:ilvl w:val="0"/>
+          <w:numId w:val="2"/>
+        </w:numPr>
+        <w:spacing w:after="0" w:before="0" w:line="264" w:lineRule="auto"/>
+      </w:pPr>
+      <w:r>
+        <w:rPr>
+          <w:b/>
+          <w:bCs/>
+        </w:rPr>
+        <w:t xml:space="preserve">4.1.1 Autonomous Systems: </w:t>
+      </w:r>
+      <w:r>
+        <w:t xml:space="preserve">The Kinect V2 had low compatibility, short range, no integrated IMU, and high sensitivity to light. We built custom ROS packages, trained ML models with specialized algorithms, implemented custom sensor fusion, and added a camera shade.</w:t>
+      </w:r>
+    </w:p>
+    <w:p>
+      <w:pPr>
+        <w:pStyle w:val="ListParagraph"/>
+        <w:numPr>
+          <w:ilvl w:val="0"/>
+          <w:numId w:val="2"/>
+        </w:numPr>
+        <w:spacing w:after="0" w:before="0" w:line="264" w:lineRule="auto"/>
+      </w:pPr>
+      <w:r>
+        <w:rPr>
+          <w:b/>
+          <w:bCs/>
+        </w:rPr>
+        <w:t xml:space="preserve">4.1.2 Robotic Arm: </w:t>
+      </w:r>
+      <w:r>
+        <w:t xml:space="preserve">The 5-DoF arm was imprecise due to an indirect gripper connection, and its gripper broke during a mission at IRC 2024. We moved to a 6-DoF design with a lead screw mechanism and custom gears, built in PETG and carbon fiber with failsafe mechanisms.</w:t>
+      </w:r>
+    </w:p>
+    <w:p>
+      <w:pPr>
+        <w:pStyle w:val="ListParagraph"/>
+        <w:numPr>
+          <w:ilvl w:val="0"/>
+          <w:numId w:val="2"/>
+        </w:numPr>
+        <w:spacing w:after="0" w:before="0" w:line="264" w:lineRule="auto"/>
+      </w:pPr>
+      <w:r>
+        <w:rPr>
+          <w:b/>
+          <w:bCs/>
+        </w:rPr>
+        <w:t xml:space="preserve">4.1.3 Science Assembly: </w:t>
+      </w:r>
+      <w:r>
+        <w:t xml:space="preserve">The standalone module relied on elastomers, was poorly placed, risked contamination, and was hard to integrate. We integrated it with the arm assembly, added an oleophobic layer, a closed test tube enclosure, and a sealed cache dropping mechanism, reduced its size, and added a cost-effective, modular Raman spectrometer.</w:t>
+      </w:r>
+    </w:p>
+    <w:p>
+      <w:pPr>
+        <w:pStyle w:val="ListParagraph"/>
+        <w:numPr>
+          <w:ilvl w:val="0"/>
+          <w:numId w:val="2"/>
+        </w:numPr>
+        <w:spacing w:after="120" w:before="0" w:line="264" w:lineRule="auto"/>
+      </w:pPr>
+      <w:r>
+        <w:rPr>
+          <w:b/>
+          <w:bCs/>
+        </w:rPr>
+        <w:t xml:space="preserve">4.1.4 Electronics &amp; Mobility: </w:t>
+      </w:r>
+      <w:r>
+        <w:t xml:space="preserve">Unreliable PCBs and small wheels were identified as a setback but were not covered with a dedicated solution.</w:t>
+      </w:r>
+    </w:p>
+    <w:p>
+      <w:pPr>
+        <w:pStyle w:val="Heading1"/>
+        <w:keepNext/>
+        <w:spacing w:after="200" w:before="0" w:line="264" w:lineRule="auto"/>
+      </w:pPr>
+      <w:r>
+        <w:t xml:space="preserve">5. Performance Analysis &amp; Lessons Learned</w:t>
+      </w:r>
+    </w:p>
+    <w:p>
+      <w:pPr>
+        <w:pStyle w:val="Heading2"/>
+        <w:keepNext/>
+        <w:spacing w:after="120" w:before="0" w:line="264" w:lineRule="auto"/>
+      </w:pPr>
+      <w:r>
+        <w:t xml:space="preserve">5.1 Strengths</w:t>
+      </w:r>
+    </w:p>
+    <w:p>
+      <w:pPr>
+        <w:pStyle w:val="ListParagraph"/>
+        <w:numPr>
+          <w:ilvl w:val="0"/>
+          <w:numId w:val="2"/>
+        </w:numPr>
+        <w:spacing w:after="0" w:before="0" w:line="264" w:lineRule="auto"/>
+      </w:pPr>
+      <w:r>
+        <w:rPr>
+          <w:b/>
+          <w:bCs/>
+        </w:rPr>
+        <w:t xml:space="preserve">5.1.1 Clear Narrative: </w:t>
+      </w:r>
+      <w:r>
+        <w:t xml:space="preserve">Every solution traced back to a specific setback under one of three pillars.</w:t>
+      </w:r>
+    </w:p>
+    <w:p>
+      <w:pPr>
+        <w:pStyle w:val="ListParagraph"/>
+        <w:numPr>
+          <w:ilvl w:val="0"/>
+          <w:numId w:val="2"/>
+        </w:numPr>
+        <w:spacing w:after="0" w:before="0" w:line="264" w:lineRule="auto"/>
+      </w:pPr>
+      <w:r>
+        <w:rPr>
+          <w:b/>
+          <w:bCs/>
+        </w:rPr>
+        <w:t xml:space="preserve">5.1.2 Measurable Corporate Progress: </w:t>
+      </w:r>
+      <w:r>
+        <w:t xml:space="preserve">A 15-point rise in sponsorship share, eight sponsors, and 100K accounts reached gave concrete evidence of the corporate overhaul.</w:t>
+      </w:r>
+    </w:p>
+    <w:p>
+      <w:pPr>
+        <w:pStyle w:val="ListParagraph"/>
+        <w:numPr>
+          <w:ilvl w:val="0"/>
+          <w:numId w:val="2"/>
+        </w:numPr>
+        <w:spacing w:after="120" w:before="0" w:line="264" w:lineRule="auto"/>
+      </w:pPr>
+      <w:r>
+        <w:rPr>
+          <w:b/>
+          <w:bCs/>
+        </w:rPr>
+        <w:t xml:space="preserve">5.1.3 Sustainable Team Model: </w:t>
+      </w:r>
+      <w:r>
+        <w:t xml:space="preserve">The operational cycle showed how knowledge and leadership pass between batches.</w:t>
+      </w:r>
+    </w:p>
+    <w:p>
+      <w:pPr>
+        <w:pStyle w:val="Heading2"/>
+        <w:keepNext/>
+        <w:spacing w:after="120" w:before="0" w:line="264" w:lineRule="auto"/>
+      </w:pPr>
+      <w:r>
+        <w:t xml:space="preserve">5.2 Performance Issues</w:t>
+      </w:r>
+    </w:p>
+    <w:p>
+      <w:pPr>
+        <w:pStyle w:val="ListParagraph"/>
+        <w:numPr>
+          <w:ilvl w:val="0"/>
+          <w:numId w:val="2"/>
+        </w:numPr>
+        <w:spacing w:after="0" w:before="0" w:line="264" w:lineRule="auto"/>
+      </w:pPr>
+      <w:r>
+        <w:rPr>
+          <w:b/>
+          <w:bCs/>
+        </w:rPr>
+        <w:t xml:space="preserve">5.2.1 No Project Plan: </w:t>
+      </w:r>
+      <w:r>
+        <w:t xml:space="preserve">We did not present a build timeline, milestones, or a risk and contingency plan for ARŌHN, leaving the implementation side of the assessment largely unaddressed.</w:t>
+      </w:r>
+    </w:p>
+    <w:p>
+      <w:pPr>
+        <w:pStyle w:val="ListParagraph"/>
+        <w:numPr>
+          <w:ilvl w:val="0"/>
+          <w:numId w:val="2"/>
+        </w:numPr>
+        <w:spacing w:after="0" w:before="0" w:line="264" w:lineRule="auto"/>
+      </w:pPr>
+      <w:r>
+        <w:rPr>
+          <w:b/>
+          <w:bCs/>
+        </w:rPr>
+        <w:t xml:space="preserve">5.2.2 No Financial Figures: </w:t>
+      </w:r>
+      <w:r>
+        <w:t xml:space="preserve">Funding was shown only as percentages, with no totals, project cost, or spending breakdown, so it could not show whether sponsorship grew in value or university funding simply fell.</w:t>
+      </w:r>
+    </w:p>
+    <w:p>
+      <w:pPr>
+        <w:pStyle w:val="ListParagraph"/>
+        <w:numPr>
+          <w:ilvl w:val="0"/>
+          <w:numId w:val="2"/>
+        </w:numPr>
+        <w:spacing w:after="0" w:before="0" w:line="264" w:lineRule="auto"/>
+      </w:pPr>
+      <w:r>
+        <w:rPr>
+          <w:b/>
+          <w:bCs/>
+        </w:rPr>
+        <w:t xml:space="preserve">5.2.3 Unproven Solutions: </w:t>
+      </w:r>
+      <w:r>
+        <w:t xml:space="preserve">Technical fixes were listed without test data or comparisons against NAMBI 2.0, and the electronics and mobility setback had no solution.</w:t>
+      </w:r>
+    </w:p>
+    <w:p>
+      <w:pPr>
+        <w:pStyle w:val="ListParagraph"/>
+        <w:numPr>
+          <w:ilvl w:val="0"/>
+          <w:numId w:val="2"/>
+        </w:numPr>
+        <w:spacing w:after="120" w:before="0" w:line="264" w:lineRule="auto"/>
+      </w:pPr>
+      <w:r>
+        <w:rPr>
+          <w:b/>
+          <w:bCs/>
+        </w:rPr>
+        <w:t xml:space="preserve">5.2.4 Generic Sponsor Offering: </w:t>
+      </w:r>
+      <w:r>
+        <w:t xml:space="preserve">Our offering was limited to events and social media outreach, with no defined deliverables or packages for sponsors.</w:t>
+      </w:r>
+    </w:p>
+    <w:p>
+      <w:pPr>
+        <w:pStyle w:val="Heading2"/>
+        <w:keepNext/>
+        <w:spacing w:after="120" w:before="0" w:line="264" w:lineRule="auto"/>
+      </w:pPr>
+      <w:r>
+        <w:t xml:space="preserve">5.3 Lessons Learned</w:t>
+      </w:r>
+    </w:p>
+    <w:p>
+      <w:pPr>
+        <w:pStyle w:val="ListParagraph"/>
+        <w:numPr>
+          <w:ilvl w:val="0"/>
+          <w:numId w:val="2"/>
+        </w:numPr>
+        <w:spacing w:after="0" w:before="0" w:line="264" w:lineRule="auto"/>
+      </w:pPr>
+      <w:r>
+        <w:rPr>
+          <w:b/>
+          <w:bCs/>
+        </w:rPr>
+        <w:t xml:space="preserve">5.3.1 Present the Plan: </w:t>
+      </w:r>
+      <w:r>
+        <w:t xml:space="preserve">Include a project timeline, key milestones, and contingency plans.</w:t>
+      </w:r>
+    </w:p>
+    <w:p>
+      <w:pPr>
+        <w:pStyle w:val="ListParagraph"/>
+        <w:numPr>
+          <w:ilvl w:val="0"/>
+          <w:numId w:val="2"/>
+        </w:numPr>
+        <w:spacing w:after="0" w:before="0" w:line="264" w:lineRule="auto"/>
+      </w:pPr>
+      <w:r>
+        <w:rPr>
+          <w:b/>
+          <w:bCs/>
+        </w:rPr>
+        <w:t xml:space="preserve">5.3.2 Back Funding with Numbers: </w:t>
+      </w:r>
+      <w:r>
+        <w:t xml:space="preserve">Show absolute funding, project cost, and spending.</w:t>
+      </w:r>
+    </w:p>
+    <w:p>
+      <w:pPr>
+        <w:pStyle w:val="ListParagraph"/>
+        <w:numPr>
+          <w:ilvl w:val="0"/>
+          <w:numId w:val="2"/>
+        </w:numPr>
+        <w:spacing w:after="0" w:before="0" w:line="264" w:lineRule="auto"/>
+      </w:pPr>
+      <w:r>
+        <w:rPr>
+          <w:b/>
+          <w:bCs/>
+        </w:rPr>
+        <w:t xml:space="preserve">5.3.3 Prove Every Solution: </w:t>
+      </w:r>
+      <w:r>
+        <w:t xml:space="preserve">Back each fix with test results and cover every setback raised.</w:t>
+      </w:r>
+    </w:p>
+    <w:p>
+      <w:pPr>
+        <w:pStyle w:val="ListParagraph"/>
+        <w:numPr>
+          <w:ilvl w:val="0"/>
+          <w:numId w:val="2"/>
+        </w:numPr>
+        <w:spacing w:after="0" w:before="0" w:line="264" w:lineRule="auto"/>
+      </w:pPr>
+      <w:r>
+        <w:rPr>
+          <w:b/>
+          <w:bCs/>
+        </w:rPr>
+        <w:t xml:space="preserve">5.3.4 Define Sponsor Value: </w:t>
+      </w:r>
+      <w:r>
+        <w:t xml:space="preserve">Present concrete deliverables for sponsors, backed by reach and engagement data.</w:t>
       </w:r>
     </w:p>
     <w:sectPr>

</xml_diff>